<commit_message>
Update Employee Issue Management project
</commit_message>
<xml_diff>
--- a/6.Project Documentation/Final_Project_Report.docx
+++ b/6.Project Documentation/Final_Project_Report.docx
@@ -51,27 +51,7 @@
           <w:sz w:val="26"/>
           <w:szCs w:val="26"/>
         </w:rPr>
-        <w:t xml:space="preserve">Employees Raise Workplace / IT Issues Through a ServiceNow Employee </w:t>
-      </w:r>
-      <w:proofErr w:type="spellStart"/>
-      <w:r>
-        <w:rPr>
-          <w:i/>
-          <w:iCs/>
-          <w:sz w:val="26"/>
-          <w:szCs w:val="26"/>
-        </w:rPr>
-        <w:t>Center</w:t>
-      </w:r>
-      <w:proofErr w:type="spellEnd"/>
-      <w:r>
-        <w:rPr>
-          <w:i/>
-          <w:iCs/>
-          <w:sz w:val="26"/>
-          <w:szCs w:val="26"/>
-        </w:rPr>
-        <w:t xml:space="preserve"> Portal</w:t>
+        <w:t>Employees Raise Workplace / IT Issues Through a ServiceNow Employee Center Portal</w:t>
       </w:r>
     </w:p>
     <w:tbl>
@@ -267,15 +247,7 @@
           </w:tcPr>
           <w:p>
             <w:r>
-              <w:t xml:space="preserve">ServiceNow (Employee </w:t>
-            </w:r>
-            <w:proofErr w:type="spellStart"/>
-            <w:r>
-              <w:t>Center</w:t>
-            </w:r>
-            <w:proofErr w:type="spellEnd"/>
-            <w:r>
-              <w:t xml:space="preserve"> / Service Portal)</w:t>
+              <w:t>ServiceNow (Employee Center / Service Portal)</w:t>
             </w:r>
           </w:p>
         </w:tc>
@@ -398,13 +370,8 @@
           </w:tcPr>
           <w:p>
             <w:r>
-              <w:t>SriyaRam12/employee-issue-management-</w:t>
-            </w:r>
-            <w:proofErr w:type="spellStart"/>
-            <w:r>
-              <w:t>servicenow</w:t>
-            </w:r>
-            <w:proofErr w:type="spellEnd"/>
+              <w:t>SriyaRam12/employee-issue-management-servicenow</w:t>
+            </w:r>
           </w:p>
         </w:tc>
       </w:tr>
@@ -882,15 +849,7 @@
         <w:jc w:val="both"/>
       </w:pPr>
       <w:r>
-        <w:t xml:space="preserve">The project, “Employee Raise Issue Management System using ServiceNow”, is a ServiceNow Employee </w:t>
-      </w:r>
-      <w:proofErr w:type="spellStart"/>
-      <w:r>
-        <w:t>Center</w:t>
-      </w:r>
-      <w:proofErr w:type="spellEnd"/>
-      <w:r>
-        <w:t xml:space="preserve"> / Service Portal based application that gives employees a centralised place to raise workplace and IT-related issues. The employee opens the portal, goes to Raise an Issue, and submits a structured form provided by the Record Producer “Raise Employee Issue”. On submission, ServiceNow creates an Employee Issue record (ticket) in a custom Employee Raise Issue table. During testing, a submission created the ticket EMP0001004.</w:t>
+        <w:t>The project, “Employee Raise Issue Management System using ServiceNow”, is a ServiceNow Employee Center / Service Portal based application that gives employees a centralised place to raise workplace and IT-related issues. The employee opens the portal, goes to Raise an Issue, and submits a structured form provided by the Record Producer “Raise Employee Issue”. On submission, ServiceNow creates an Employee Issue record (ticket) in a custom Employee Raise Issue table. During testing, a submission created the ticket EMP0001004.</w:t>
       </w:r>
     </w:p>
     <w:p>
@@ -899,15 +858,7 @@
         <w:jc w:val="both"/>
       </w:pPr>
       <w:r>
-        <w:t xml:space="preserve">The solution is built as a custom ServiceNow application containing a custom table, a Record Producer with </w:t>
-      </w:r>
-      <w:proofErr w:type="spellStart"/>
-      <w:r>
-        <w:t>catalog</w:t>
-      </w:r>
-      <w:proofErr w:type="spellEnd"/>
-      <w:r>
-        <w:t xml:space="preserve"> variables mapped to the table fields, and UI policies / dependencies for the Employee Issue form. The portal experience is customised with Service Portal Designer and a custom Commercial Services widget written in HTML and CSS/SCSS. The application is connected to GitHub for source control.</w:t>
+        <w:t>The solution is built as a custom ServiceNow application containing a custom table, a Record Producer with catalog variables mapped to the table fields, and UI policies / dependencies for the Employee Issue form. The portal experience is customised with Service Portal Designer and a custom Commercial Services widget written in HTML and CSS/SCSS. The application is connected to GitHub for source control.</w:t>
       </w:r>
     </w:p>
     <w:p>
@@ -955,15 +906,7 @@
         <w:jc w:val="both"/>
       </w:pPr>
       <w:r>
-        <w:t xml:space="preserve">Provide a centralised Employee </w:t>
-      </w:r>
-      <w:proofErr w:type="spellStart"/>
-      <w:r>
-        <w:t>Center</w:t>
-      </w:r>
-      <w:proofErr w:type="spellEnd"/>
-      <w:r>
-        <w:t xml:space="preserve"> / Service Portal from which employees can raise issues.</w:t>
+        <w:t>Provide a centralised Employee Center / Service Portal from which employees can raise issues.</w:t>
       </w:r>
     </w:p>
     <w:p>
@@ -1109,15 +1052,7 @@
         <w:jc w:val="both"/>
       </w:pPr>
       <w:r>
-        <w:t xml:space="preserve">The empathy map focuses on the employee as the primary user who raises issues through the Employee </w:t>
-      </w:r>
-      <w:proofErr w:type="spellStart"/>
-      <w:r>
-        <w:t>Center</w:t>
-      </w:r>
-      <w:proofErr w:type="spellEnd"/>
-      <w:r>
-        <w:t xml:space="preserve"> portal. It was prepared from an analysis of the problem context.</w:t>
+        <w:t>The empathy map focuses on the employee as the primary user who raises issues through the Employee Center portal. It was prepared from an analysis of the problem context.</w:t>
       </w:r>
     </w:p>
     <w:tbl>
@@ -1426,23 +1361,7 @@
                 <w:sz w:val="20"/>
                 <w:szCs w:val="20"/>
               </w:rPr>
-              <w:t xml:space="preserve">The Employee </w:t>
-            </w:r>
-            <w:proofErr w:type="spellStart"/>
-            <w:r>
-              <w:rPr>
-                <w:sz w:val="20"/>
-                <w:szCs w:val="20"/>
-              </w:rPr>
-              <w:t>Center</w:t>
-            </w:r>
-            <w:proofErr w:type="spellEnd"/>
-            <w:r>
-              <w:rPr>
-                <w:sz w:val="20"/>
-                <w:szCs w:val="20"/>
-              </w:rPr>
-              <w:t xml:space="preserve"> portal with Search, Quick Links, My Active Items and Recommended for You.</w:t>
+              <w:t>The Employee Center portal with Search, Quick Links, My Active Items and Recommended for You.</w:t>
             </w:r>
           </w:p>
           <w:p>
@@ -1554,23 +1473,7 @@
                 <w:sz w:val="20"/>
                 <w:szCs w:val="20"/>
               </w:rPr>
-              <w:t xml:space="preserve">Opens Employee </w:t>
-            </w:r>
-            <w:proofErr w:type="spellStart"/>
-            <w:r>
-              <w:rPr>
-                <w:sz w:val="20"/>
-                <w:szCs w:val="20"/>
-              </w:rPr>
-              <w:t>Center</w:t>
-            </w:r>
-            <w:proofErr w:type="spellEnd"/>
-            <w:r>
-              <w:rPr>
-                <w:sz w:val="20"/>
-                <w:szCs w:val="20"/>
-              </w:rPr>
-              <w:t>.</w:t>
+              <w:t>Opens Employee Center.</w:t>
             </w:r>
           </w:p>
           <w:p>
@@ -2149,39 +2052,7 @@
                 <w:sz w:val="20"/>
                 <w:szCs w:val="20"/>
               </w:rPr>
-              <w:t xml:space="preserve">Employee </w:t>
-            </w:r>
-            <w:proofErr w:type="spellStart"/>
-            <w:r>
-              <w:rPr>
-                <w:sz w:val="20"/>
-                <w:szCs w:val="20"/>
-              </w:rPr>
-              <w:t>Center</w:t>
-            </w:r>
-            <w:proofErr w:type="spellEnd"/>
-            <w:r>
-              <w:rPr>
-                <w:sz w:val="20"/>
-                <w:szCs w:val="20"/>
-              </w:rPr>
-              <w:t xml:space="preserve"> portal as a </w:t>
-            </w:r>
-            <w:proofErr w:type="gramStart"/>
-            <w:r>
-              <w:rPr>
-                <w:sz w:val="20"/>
-                <w:szCs w:val="20"/>
-              </w:rPr>
-              <w:t>single entry</w:t>
-            </w:r>
-            <w:proofErr w:type="gramEnd"/>
-            <w:r>
-              <w:rPr>
-                <w:sz w:val="20"/>
-                <w:szCs w:val="20"/>
-              </w:rPr>
-              <w:t xml:space="preserve"> point</w:t>
+              <w:t>Employee Center portal as a single entry point</w:t>
             </w:r>
           </w:p>
         </w:tc>
@@ -3703,15 +3574,7 @@
         <w:t>Selected idea:</w:t>
       </w:r>
       <w:r>
-        <w:t xml:space="preserve"> provide a ServiceNow Employee </w:t>
-      </w:r>
-      <w:proofErr w:type="spellStart"/>
-      <w:r>
-        <w:t>Center</w:t>
-      </w:r>
-      <w:proofErr w:type="spellEnd"/>
-      <w:r>
-        <w:t xml:space="preserve"> portal with a Record Producer that creates issue records in a custom table. This idea was selected because it directly addresses the identified problem and can be implemented with standard ServiceNow capabilities.</w:t>
+        <w:t xml:space="preserve"> provide a ServiceNow Employee Center portal with a Record Producer that creates issue records in a custom table. This idea was selected because it directly addresses the identified problem and can be implemented with standard ServiceNow capabilities.</w:t>
       </w:r>
     </w:p>
     <w:p>
@@ -4053,23 +3916,7 @@
                 <w:sz w:val="17"/>
                 <w:szCs w:val="17"/>
               </w:rPr>
-              <w:t xml:space="preserve">Opens the Employee </w:t>
-            </w:r>
-            <w:proofErr w:type="spellStart"/>
-            <w:r>
-              <w:rPr>
-                <w:sz w:val="17"/>
-                <w:szCs w:val="17"/>
-              </w:rPr>
-              <w:t>Center</w:t>
-            </w:r>
-            <w:proofErr w:type="spellEnd"/>
-            <w:r>
-              <w:rPr>
-                <w:sz w:val="17"/>
-                <w:szCs w:val="17"/>
-              </w:rPr>
-              <w:t xml:space="preserve"> portal.</w:t>
+              <w:t>Opens the Employee Center portal.</w:t>
             </w:r>
           </w:p>
         </w:tc>
@@ -4239,23 +4086,7 @@
                 <w:sz w:val="17"/>
                 <w:szCs w:val="17"/>
               </w:rPr>
-              <w:t xml:space="preserve">Employee </w:t>
-            </w:r>
-            <w:proofErr w:type="spellStart"/>
-            <w:r>
-              <w:rPr>
-                <w:sz w:val="17"/>
-                <w:szCs w:val="17"/>
-              </w:rPr>
-              <w:t>Center</w:t>
-            </w:r>
-            <w:proofErr w:type="spellEnd"/>
-            <w:r>
-              <w:rPr>
-                <w:sz w:val="17"/>
-                <w:szCs w:val="17"/>
-              </w:rPr>
-              <w:t xml:space="preserve"> homepage, Search, Quick Links.</w:t>
+              <w:t>Employee Center homepage, Search, Quick Links.</w:t>
             </w:r>
           </w:p>
         </w:tc>
@@ -5368,20 +5199,8 @@
                 <w:sz w:val="20"/>
                 <w:szCs w:val="20"/>
               </w:rPr>
-              <w:t xml:space="preserve">Sub Requirement / Expected </w:t>
-            </w:r>
-            <w:proofErr w:type="spellStart"/>
-            <w:r>
-              <w:rPr>
-                <w:b/>
-                <w:bCs/>
-                <w:color w:val="FFFFFF"/>
-                <w:sz w:val="20"/>
-                <w:szCs w:val="20"/>
-              </w:rPr>
-              <w:t>Behavior</w:t>
-            </w:r>
-            <w:proofErr w:type="spellEnd"/>
+              <w:t>Sub Requirement / Expected Behavior</w:t>
+            </w:r>
           </w:p>
         </w:tc>
         <w:tc>
@@ -5500,23 +5319,7 @@
                 <w:sz w:val="20"/>
                 <w:szCs w:val="20"/>
               </w:rPr>
-              <w:t xml:space="preserve">Employees can open the Employee </w:t>
-            </w:r>
-            <w:proofErr w:type="spellStart"/>
-            <w:r>
-              <w:rPr>
-                <w:sz w:val="20"/>
-                <w:szCs w:val="20"/>
-              </w:rPr>
-              <w:t>Center</w:t>
-            </w:r>
-            <w:proofErr w:type="spellEnd"/>
-            <w:r>
-              <w:rPr>
-                <w:sz w:val="20"/>
-                <w:szCs w:val="20"/>
-              </w:rPr>
-              <w:t>-based Service Portal (https://dev402706.service-now.com/employee_request), which provides Search, Raise an Issue, Raise Ticket, Quick Links, My Active Items and Recommended for You.</w:t>
+              <w:t>Employees can open the Employee Center-based Service Portal (https://dev402706.service-now.com/employee_request), which provides Search, Raise an Issue, Raise Ticket, Quick Links, My Active Items and Recommended for You.</w:t>
             </w:r>
           </w:p>
         </w:tc>
@@ -5752,23 +5555,7 @@
                 <w:sz w:val="20"/>
                 <w:szCs w:val="20"/>
               </w:rPr>
-              <w:t xml:space="preserve">The Requester variable is a reference to the </w:t>
-            </w:r>
-            <w:proofErr w:type="spellStart"/>
-            <w:r>
-              <w:rPr>
-                <w:sz w:val="20"/>
-                <w:szCs w:val="20"/>
-              </w:rPr>
-              <w:t>sys_user</w:t>
-            </w:r>
-            <w:proofErr w:type="spellEnd"/>
-            <w:r>
-              <w:rPr>
-                <w:sz w:val="20"/>
-                <w:szCs w:val="20"/>
-              </w:rPr>
-              <w:t xml:space="preserve"> table.</w:t>
+              <w:t>The Requester variable is a reference to the sys_user table.</w:t>
             </w:r>
           </w:p>
         </w:tc>
@@ -6713,23 +6500,7 @@
                 <w:sz w:val="20"/>
                 <w:szCs w:val="20"/>
               </w:rPr>
-              <w:t xml:space="preserve">A custom Commercial Services widget (HTML, CSS/SCSS) is displayed on the Employee </w:t>
-            </w:r>
-            <w:proofErr w:type="spellStart"/>
-            <w:r>
-              <w:rPr>
-                <w:sz w:val="20"/>
-                <w:szCs w:val="20"/>
-              </w:rPr>
-              <w:t>Center</w:t>
-            </w:r>
-            <w:proofErr w:type="spellEnd"/>
-            <w:r>
-              <w:rPr>
-                <w:sz w:val="20"/>
-                <w:szCs w:val="20"/>
-              </w:rPr>
-              <w:t xml:space="preserve"> homepage.</w:t>
+              <w:t>A custom Commercial Services widget (HTML, CSS/SCSS) is displayed on the Employee Center homepage.</w:t>
             </w:r>
           </w:p>
         </w:tc>
@@ -6847,23 +6618,7 @@
                 <w:sz w:val="20"/>
                 <w:szCs w:val="20"/>
               </w:rPr>
-              <w:t>The ServiceNow application is connected to and committed to the GitHub repository SriyaRam12/employee-issue-management-</w:t>
-            </w:r>
-            <w:proofErr w:type="spellStart"/>
-            <w:r>
-              <w:rPr>
-                <w:sz w:val="20"/>
-                <w:szCs w:val="20"/>
-              </w:rPr>
-              <w:t>servicenow</w:t>
-            </w:r>
-            <w:proofErr w:type="spellEnd"/>
-            <w:r>
-              <w:rPr>
-                <w:sz w:val="20"/>
-                <w:szCs w:val="20"/>
-              </w:rPr>
-              <w:t>.</w:t>
+              <w:t>The ServiceNow application is connected to and committed to the GitHub repository SriyaRam12/employee-issue-management-servicenow.</w:t>
             </w:r>
           </w:p>
         </w:tc>
@@ -7887,23 +7642,7 @@
         <w:jc w:val="both"/>
       </w:pPr>
       <w:r>
-        <w:t xml:space="preserve">The data flow shows how an issue moves through the platform. The employee submits issue details through the Employee </w:t>
-      </w:r>
-      <w:proofErr w:type="spellStart"/>
-      <w:r>
-        <w:t>Center</w:t>
-      </w:r>
-      <w:proofErr w:type="spellEnd"/>
-      <w:r>
-        <w:t xml:space="preserve"> portal and the Raise Employee Issue Record Producer. The Requester is looked up in the </w:t>
-      </w:r>
-      <w:proofErr w:type="spellStart"/>
-      <w:r>
-        <w:t>sys_user</w:t>
-      </w:r>
-      <w:proofErr w:type="spellEnd"/>
-      <w:r>
-        <w:t xml:space="preserve"> table, and a new record is stored in the Employee Raise Issue table. Authorised ServiceNow users can then track and manage the stored records.</w:t>
+        <w:t>The data flow shows how an issue moves through the platform. The employee submits issue details through the Employee Center portal and the Raise Employee Issue Record Producer. The Requester is looked up in the sys_user table, and a new record is stored in the Employee Raise Issue table. Authorised ServiceNow users can then track and manage the stored records.</w:t>
       </w:r>
     </w:p>
     <w:p>
@@ -8157,23 +7896,7 @@
                 <w:sz w:val="20"/>
                 <w:szCs w:val="20"/>
               </w:rPr>
-              <w:t xml:space="preserve">Employee </w:t>
-            </w:r>
-            <w:proofErr w:type="spellStart"/>
-            <w:r>
-              <w:rPr>
-                <w:sz w:val="20"/>
-                <w:szCs w:val="20"/>
-              </w:rPr>
-              <w:t>Center</w:t>
-            </w:r>
-            <w:proofErr w:type="spellEnd"/>
-            <w:r>
-              <w:rPr>
-                <w:sz w:val="20"/>
-                <w:szCs w:val="20"/>
-              </w:rPr>
-              <w:t xml:space="preserve"> / Service Portal</w:t>
+              <w:t>Employee Center / Service Portal</w:t>
             </w:r>
           </w:p>
         </w:tc>
@@ -8346,7 +8069,6 @@
             </w:tcMar>
           </w:tcPr>
           <w:p>
-            <w:proofErr w:type="spellStart"/>
             <w:r>
               <w:rPr>
                 <w:sz w:val="20"/>
@@ -8354,7 +8076,6 @@
               </w:rPr>
               <w:t>sys_user</w:t>
             </w:r>
-            <w:proofErr w:type="spellEnd"/>
           </w:p>
         </w:tc>
         <w:tc>
@@ -8846,23 +8567,7 @@
                 <w:sz w:val="20"/>
                 <w:szCs w:val="20"/>
               </w:rPr>
-              <w:t xml:space="preserve">Employee </w:t>
-            </w:r>
-            <w:proofErr w:type="spellStart"/>
-            <w:r>
-              <w:rPr>
-                <w:sz w:val="20"/>
-                <w:szCs w:val="20"/>
-              </w:rPr>
-              <w:t>Center</w:t>
-            </w:r>
-            <w:proofErr w:type="spellEnd"/>
-            <w:r>
-              <w:rPr>
-                <w:sz w:val="20"/>
-                <w:szCs w:val="20"/>
-              </w:rPr>
-              <w:t xml:space="preserve"> / Service Portal; Service Portal Designer</w:t>
+              <w:t>Employee Center / Service Portal; Service Portal Designer</w:t>
             </w:r>
           </w:p>
         </w:tc>
@@ -9129,17 +8834,8 @@
                 <w:sz w:val="20"/>
                 <w:szCs w:val="20"/>
               </w:rPr>
-              <w:t xml:space="preserve">Custom Employee Raise Issue table; </w:t>
-            </w:r>
-            <w:proofErr w:type="spellStart"/>
-            <w:r>
-              <w:rPr>
-                <w:sz w:val="20"/>
-                <w:szCs w:val="20"/>
-              </w:rPr>
-              <w:t>sys_user</w:t>
-            </w:r>
-            <w:proofErr w:type="spellEnd"/>
+              <w:t>Custom Employee Raise Issue table; sys_user</w:t>
+            </w:r>
           </w:p>
         </w:tc>
         <w:tc>
@@ -9227,23 +8923,7 @@
                 <w:sz w:val="20"/>
                 <w:szCs w:val="20"/>
               </w:rPr>
-              <w:t xml:space="preserve">Record Producer with </w:t>
-            </w:r>
-            <w:proofErr w:type="spellStart"/>
-            <w:r>
-              <w:rPr>
-                <w:sz w:val="20"/>
-                <w:szCs w:val="20"/>
-              </w:rPr>
-              <w:t>catalog</w:t>
-            </w:r>
-            <w:proofErr w:type="spellEnd"/>
-            <w:r>
-              <w:rPr>
-                <w:sz w:val="20"/>
-                <w:szCs w:val="20"/>
-              </w:rPr>
-              <w:t xml:space="preserve"> / record-producer variables</w:t>
+              <w:t>Record Producer with catalog / record-producer variables</w:t>
             </w:r>
           </w:p>
         </w:tc>
@@ -9658,15 +9338,7 @@
         <w:jc w:val="both"/>
       </w:pPr>
       <w:r>
-        <w:t xml:space="preserve">The problem-solution fit is achieved by replacing scattered, unstructured issue reporting with a single Employee </w:t>
-      </w:r>
-      <w:proofErr w:type="spellStart"/>
-      <w:r>
-        <w:t>Center</w:t>
-      </w:r>
-      <w:proofErr w:type="spellEnd"/>
-      <w:r>
-        <w:t xml:space="preserve"> portal and a structured Record Producer that stores every issue as a record in a custom table.</w:t>
+        <w:t>The problem-solution fit is achieved by replacing scattered, unstructured issue reporting with a single Employee Center portal and a structured Record Producer that stores every issue as a record in a custom table.</w:t>
       </w:r>
     </w:p>
     <w:tbl>
@@ -10214,23 +9886,7 @@
                 <w:sz w:val="20"/>
                 <w:szCs w:val="20"/>
               </w:rPr>
-              <w:t xml:space="preserve">Employees currently report through informal channels and follow up repeatedly. With the solution they open Employee </w:t>
-            </w:r>
-            <w:proofErr w:type="spellStart"/>
-            <w:r>
-              <w:rPr>
-                <w:sz w:val="20"/>
-                <w:szCs w:val="20"/>
-              </w:rPr>
-              <w:t>Center</w:t>
-            </w:r>
-            <w:proofErr w:type="spellEnd"/>
-            <w:r>
-              <w:rPr>
-                <w:sz w:val="20"/>
-                <w:szCs w:val="20"/>
-              </w:rPr>
-              <w:t>, go to Raise an Issue, fill in the form and submit.</w:t>
+              <w:t>Employees currently report through informal channels and follow up repeatedly. With the solution they open Employee Center, go to Raise an Issue, fill in the form and submit.</w:t>
             </w:r>
           </w:p>
         </w:tc>
@@ -10295,23 +9951,7 @@
                 <w:sz w:val="20"/>
                 <w:szCs w:val="20"/>
               </w:rPr>
-              <w:t xml:space="preserve">Online: Employee </w:t>
-            </w:r>
-            <w:proofErr w:type="spellStart"/>
-            <w:r>
-              <w:rPr>
-                <w:sz w:val="20"/>
-                <w:szCs w:val="20"/>
-              </w:rPr>
-              <w:t>Center</w:t>
-            </w:r>
-            <w:proofErr w:type="spellEnd"/>
-            <w:r>
-              <w:rPr>
-                <w:sz w:val="20"/>
-                <w:szCs w:val="20"/>
-              </w:rPr>
-              <w:t xml:space="preserve"> portal (https://dev402706.service-now.com/employee_request). Offline: phone calls and in-person reports, which the portal aims to reduce reliance on; it does not integrate with them.</w:t>
+              <w:t>Online: Employee Center portal (https://dev402706.service-now.com/employee_request). Offline: phone calls and in-person reports, which the portal aims to reduce reliance on; it does not integrate with them.</w:t>
             </w:r>
           </w:p>
         </w:tc>
@@ -10441,23 +10081,7 @@
                 <w:sz w:val="20"/>
                 <w:szCs w:val="20"/>
               </w:rPr>
-              <w:t xml:space="preserve">Employee </w:t>
-            </w:r>
-            <w:proofErr w:type="spellStart"/>
-            <w:r>
-              <w:rPr>
-                <w:sz w:val="20"/>
-                <w:szCs w:val="20"/>
-              </w:rPr>
-              <w:t>Center</w:t>
-            </w:r>
-            <w:proofErr w:type="spellEnd"/>
-            <w:r>
-              <w:rPr>
-                <w:sz w:val="20"/>
-                <w:szCs w:val="20"/>
-              </w:rPr>
-              <w:t xml:space="preserve"> portal + Record Producer “Raise Employee Issue” + custom Employee Raise Issue table + UI policies + Commercial Services widget.</w:t>
+              <w:t>Employee Center portal + Record Producer “Raise Employee Issue” + custom Employee Raise Issue table + UI policies + Commercial Services widget.</w:t>
             </w:r>
           </w:p>
         </w:tc>
@@ -10478,15 +10102,7 @@
         <w:jc w:val="both"/>
       </w:pPr>
       <w:r>
-        <w:t xml:space="preserve">The proposed solution is a custom ServiceNow application delivered through an Employee </w:t>
-      </w:r>
-      <w:proofErr w:type="spellStart"/>
-      <w:r>
-        <w:t>Center</w:t>
-      </w:r>
-      <w:proofErr w:type="spellEnd"/>
-      <w:r>
-        <w:t>-based Service Portal. The employee flow is:</w:t>
+        <w:t>The proposed solution is a custom ServiceNow application delivered through an Employee Center-based Service Portal. The employee flow is:</w:t>
       </w:r>
     </w:p>
     <w:p>
@@ -10500,15 +10116,7 @@
         <w:jc w:val="both"/>
       </w:pPr>
       <w:r>
-        <w:t xml:space="preserve">The employee opens the Employee </w:t>
-      </w:r>
-      <w:proofErr w:type="spellStart"/>
-      <w:r>
-        <w:t>Center</w:t>
-      </w:r>
-      <w:proofErr w:type="spellEnd"/>
-      <w:r>
-        <w:t xml:space="preserve"> portal.</w:t>
+        <w:t>The employee opens the Employee Center portal.</w:t>
       </w:r>
     </w:p>
     <w:p>
@@ -10807,23 +10415,7 @@
                 <w:sz w:val="20"/>
                 <w:szCs w:val="20"/>
               </w:rPr>
-              <w:t xml:space="preserve">Employee </w:t>
-            </w:r>
-            <w:proofErr w:type="spellStart"/>
-            <w:r>
-              <w:rPr>
-                <w:sz w:val="20"/>
-                <w:szCs w:val="20"/>
-              </w:rPr>
-              <w:t>Center</w:t>
-            </w:r>
-            <w:proofErr w:type="spellEnd"/>
-            <w:r>
-              <w:rPr>
-                <w:sz w:val="20"/>
-                <w:szCs w:val="20"/>
-              </w:rPr>
-              <w:t xml:space="preserve"> portal with a Record Producer that captures structured issue information and creates records in a custom Employee Raise Issue table.</w:t>
+              <w:t>Employee Center portal with a Record Producer that captures structured issue information and creates records in a custom Employee Raise Issue table.</w:t>
             </w:r>
           </w:p>
         </w:tc>
@@ -11104,23 +10696,7 @@
         <w:jc w:val="both"/>
       </w:pPr>
       <w:r>
-        <w:t xml:space="preserve">The architecture connects the employee, the Employee </w:t>
-      </w:r>
-      <w:proofErr w:type="spellStart"/>
-      <w:r>
-        <w:t>Center</w:t>
-      </w:r>
-      <w:proofErr w:type="spellEnd"/>
-      <w:r>
-        <w:t xml:space="preserve"> portal, the Raise Employee Issue Record Producer and the custom Employee Raise Issue table inside a custom ServiceNow application. </w:t>
-      </w:r>
-      <w:proofErr w:type="spellStart"/>
-      <w:r>
-        <w:t>sys_user</w:t>
-      </w:r>
-      <w:proofErr w:type="spellEnd"/>
-      <w:r>
-        <w:t xml:space="preserve"> provides the requester reference, UI policies apply to the Employee Issue form, and the application is committed to GitHub. Planned enhancements are shown separately and are not implemented.</w:t>
+        <w:t>The architecture connects the employee, the Employee Center portal, the Raise Employee Issue Record Producer and the custom Employee Raise Issue table inside a custom ServiceNow application. sys_user provides the requester reference, UI policies apply to the Employee Issue form, and the application is committed to GitHub. Planned enhancements are shown separately and are not implemented.</w:t>
       </w:r>
     </w:p>
     <w:p>
@@ -11379,23 +10955,7 @@
                 <w:sz w:val="20"/>
                 <w:szCs w:val="20"/>
               </w:rPr>
-              <w:t xml:space="preserve">Employee </w:t>
-            </w:r>
-            <w:proofErr w:type="spellStart"/>
-            <w:r>
-              <w:rPr>
-                <w:sz w:val="20"/>
-                <w:szCs w:val="20"/>
-              </w:rPr>
-              <w:t>Center</w:t>
-            </w:r>
-            <w:proofErr w:type="spellEnd"/>
-            <w:r>
-              <w:rPr>
-                <w:sz w:val="20"/>
-                <w:szCs w:val="20"/>
-              </w:rPr>
-              <w:t xml:space="preserve"> / Service Portal</w:t>
+              <w:t>Employee Center / Service Portal</w:t>
             </w:r>
           </w:p>
         </w:tc>
@@ -11642,7 +11202,6 @@
             </w:tcMar>
           </w:tcPr>
           <w:p>
-            <w:proofErr w:type="spellStart"/>
             <w:r>
               <w:rPr>
                 <w:sz w:val="20"/>
@@ -11650,7 +11209,6 @@
               </w:rPr>
               <w:t>sys_user</w:t>
             </w:r>
-            <w:proofErr w:type="spellEnd"/>
           </w:p>
         </w:tc>
         <w:tc>
@@ -11864,23 +11422,7 @@
                 <w:sz w:val="20"/>
                 <w:szCs w:val="20"/>
               </w:rPr>
-              <w:t>Repository SriyaRam12/employee-issue-management-</w:t>
-            </w:r>
-            <w:proofErr w:type="spellStart"/>
-            <w:r>
-              <w:rPr>
-                <w:sz w:val="20"/>
-                <w:szCs w:val="20"/>
-              </w:rPr>
-              <w:t>servicenow</w:t>
-            </w:r>
-            <w:proofErr w:type="spellEnd"/>
-            <w:r>
-              <w:rPr>
-                <w:sz w:val="20"/>
-                <w:szCs w:val="20"/>
-              </w:rPr>
-              <w:t>; the application was committed through ServiceNow’s source-control integration.</w:t>
+              <w:t>Repository SriyaRam12/employee-issue-management-servicenow; the application was committed through ServiceNow’s source-control integration.</w:t>
             </w:r>
           </w:p>
         </w:tc>
@@ -12127,23 +11669,7 @@
                 <w:sz w:val="20"/>
                 <w:szCs w:val="20"/>
               </w:rPr>
-              <w:t>Reference to a user (</w:t>
-            </w:r>
-            <w:proofErr w:type="spellStart"/>
-            <w:r>
-              <w:rPr>
-                <w:sz w:val="20"/>
-                <w:szCs w:val="20"/>
-              </w:rPr>
-              <w:t>sys_user</w:t>
-            </w:r>
-            <w:proofErr w:type="spellEnd"/>
-            <w:r>
-              <w:rPr>
-                <w:sz w:val="20"/>
-                <w:szCs w:val="20"/>
-              </w:rPr>
-              <w:t>)</w:t>
+              <w:t>Reference to a user (sys_user)</w:t>
             </w:r>
           </w:p>
         </w:tc>
@@ -12971,23 +12497,7 @@
                 <w:sz w:val="19"/>
                 <w:szCs w:val="19"/>
               </w:rPr>
-              <w:t>Reference (</w:t>
-            </w:r>
-            <w:proofErr w:type="spellStart"/>
-            <w:r>
-              <w:rPr>
-                <w:sz w:val="19"/>
-                <w:szCs w:val="19"/>
-              </w:rPr>
-              <w:t>sys_user</w:t>
-            </w:r>
-            <w:proofErr w:type="spellEnd"/>
-            <w:r>
-              <w:rPr>
-                <w:sz w:val="19"/>
-                <w:szCs w:val="19"/>
-              </w:rPr>
-              <w:t>)</w:t>
+              <w:t>Reference (sys_user)</w:t>
             </w:r>
           </w:p>
         </w:tc>
@@ -13668,15 +13178,7 @@
         <w:jc w:val="both"/>
       </w:pPr>
       <w:r>
-        <w:t xml:space="preserve">An Employee </w:t>
-      </w:r>
-      <w:proofErr w:type="spellStart"/>
-      <w:r>
-        <w:t>Center</w:t>
-      </w:r>
-      <w:proofErr w:type="spellEnd"/>
-      <w:r>
-        <w:t>-based Service Portal was created and configured using Service Portal Designer. The demo portal is https://dev402706.service-now.com/employee_request.</w:t>
+        <w:t>An Employee Center-based Service Portal was created and configured using Service Portal Designer. The demo portal is https://dev402706.service-now.com/employee_request.</w:t>
       </w:r>
     </w:p>
     <w:tbl>
@@ -13808,27 +13310,7 @@
                 <w:sz w:val="20"/>
                 <w:szCs w:val="20"/>
               </w:rPr>
-              <w:t xml:space="preserve">Employee </w:t>
-            </w:r>
-            <w:proofErr w:type="spellStart"/>
-            <w:r>
-              <w:rPr>
-                <w:b/>
-                <w:bCs/>
-                <w:sz w:val="20"/>
-                <w:szCs w:val="20"/>
-              </w:rPr>
-              <w:t>Center</w:t>
-            </w:r>
-            <w:proofErr w:type="spellEnd"/>
-            <w:r>
-              <w:rPr>
-                <w:b/>
-                <w:bCs/>
-                <w:sz w:val="20"/>
-                <w:szCs w:val="20"/>
-              </w:rPr>
-              <w:t xml:space="preserve"> homepage</w:t>
+              <w:t>Employee Center homepage</w:t>
             </w:r>
           </w:p>
         </w:tc>
@@ -14266,15 +13748,7 @@
         <w:jc w:val="both"/>
       </w:pPr>
       <w:r>
-        <w:t xml:space="preserve">A custom Service Portal widget, used as the Commercial Services widget, was created with custom HTML and CSS/SCSS and added to the Employee </w:t>
-      </w:r>
-      <w:proofErr w:type="spellStart"/>
-      <w:r>
-        <w:t>Center</w:t>
-      </w:r>
-      <w:proofErr w:type="spellEnd"/>
-      <w:r>
-        <w:t xml:space="preserve"> homepage.</w:t>
+        <w:t>A custom Service Portal widget, used as the Commercial Services widget, was created with custom HTML and CSS/SCSS and added to the Employee Center homepage.</w:t>
       </w:r>
     </w:p>
     <w:tbl>
@@ -14778,15 +14252,7 @@
         <w:jc w:val="both"/>
       </w:pPr>
       <w:r>
-        <w:t>The ServiceNow application was connected to the GitHub repository SriyaRam12/employee-issue-management-</w:t>
-      </w:r>
-      <w:proofErr w:type="spellStart"/>
-      <w:r>
-        <w:t>servicenow</w:t>
-      </w:r>
-      <w:proofErr w:type="spellEnd"/>
-      <w:r>
-        <w:t xml:space="preserve"> and successfully committed. The repository is intended to hold project documentation, widget HTML/CSS, screenshots, architecture and design documentation, requirements, testing documentation and implementation evidence. The whole ServiceNow instance is not represented as ordinary source-code files; application metadata is stored through ServiceNow’s source-control integration.</w:t>
+        <w:t>The ServiceNow application was connected to the GitHub repository SriyaRam12/employee-issue-management-servicenow and successfully committed. The repository is intended to hold project documentation, widget HTML/CSS, screenshots, architecture and design documentation, requirements, testing documentation and implementation evidence. The whole ServiceNow instance is not represented as ordinary source-code files; application metadata is stored through ServiceNow’s source-control integration.</w:t>
       </w:r>
     </w:p>
     <w:p>
@@ -15415,23 +14881,7 @@
                 <w:sz w:val="19"/>
                 <w:szCs w:val="19"/>
               </w:rPr>
-              <w:t xml:space="preserve">As an employee, I want one portal where I can find Raise an Issue (Employee </w:t>
-            </w:r>
-            <w:proofErr w:type="spellStart"/>
-            <w:r>
-              <w:rPr>
-                <w:sz w:val="19"/>
-                <w:szCs w:val="19"/>
-              </w:rPr>
-              <w:t>Center</w:t>
-            </w:r>
-            <w:proofErr w:type="spellEnd"/>
-            <w:r>
-              <w:rPr>
-                <w:sz w:val="19"/>
-                <w:szCs w:val="19"/>
-              </w:rPr>
-              <w:t xml:space="preserve"> / Service Portal).</w:t>
+              <w:t>As an employee, I want one portal where I can find Raise an Issue (Employee Center / Service Portal).</w:t>
             </w:r>
           </w:p>
         </w:tc>
@@ -16082,15 +15532,7 @@
         <w:jc w:val="both"/>
       </w:pPr>
       <w:r>
-        <w:t xml:space="preserve">Functional testing verified the end-to-end path from the Employee </w:t>
-      </w:r>
-      <w:proofErr w:type="spellStart"/>
-      <w:r>
-        <w:t>Center</w:t>
-      </w:r>
-      <w:proofErr w:type="spellEnd"/>
-      <w:r>
-        <w:t xml:space="preserve"> portal to the creation of an Employee Issue record, together with the choice fields and the custom widget.</w:t>
+        <w:t>Functional testing verified the end-to-end path from the Employee Center portal to the creation of an Employee Issue record, together with the choice fields and the custom widget.</w:t>
       </w:r>
     </w:p>
     <w:tbl>
@@ -16310,65 +15752,33 @@
                 <w:sz w:val="19"/>
                 <w:szCs w:val="19"/>
               </w:rPr>
-              <w:t xml:space="preserve">Employee </w:t>
-            </w:r>
-            <w:proofErr w:type="spellStart"/>
+              <w:t>Employee Center accessibility</w:t>
+            </w:r>
+          </w:p>
+        </w:tc>
+        <w:tc>
+          <w:tcPr>
+            <w:tcW w:w="4526" w:type="dxa"/>
+            <w:tcBorders>
+              <w:top w:val="single" w:sz="4" w:space="0" w:color="000000"/>
+              <w:left w:val="single" w:sz="4" w:space="0" w:color="000000"/>
+              <w:bottom w:val="single" w:sz="4" w:space="0" w:color="000000"/>
+              <w:right w:val="single" w:sz="4" w:space="0" w:color="000000"/>
+            </w:tcBorders>
+            <w:tcMar>
+              <w:top w:w="60" w:type="dxa"/>
+              <w:left w:w="100" w:type="dxa"/>
+              <w:bottom w:w="60" w:type="dxa"/>
+              <w:right w:w="100" w:type="dxa"/>
+            </w:tcMar>
+          </w:tcPr>
+          <w:p>
             <w:r>
               <w:rPr>
                 <w:sz w:val="19"/>
                 <w:szCs w:val="19"/>
               </w:rPr>
-              <w:t>Center</w:t>
-            </w:r>
-            <w:proofErr w:type="spellEnd"/>
-            <w:r>
-              <w:rPr>
-                <w:sz w:val="19"/>
-                <w:szCs w:val="19"/>
-              </w:rPr>
-              <w:t xml:space="preserve"> accessibility</w:t>
-            </w:r>
-          </w:p>
-        </w:tc>
-        <w:tc>
-          <w:tcPr>
-            <w:tcW w:w="4526" w:type="dxa"/>
-            <w:tcBorders>
-              <w:top w:val="single" w:sz="4" w:space="0" w:color="000000"/>
-              <w:left w:val="single" w:sz="4" w:space="0" w:color="000000"/>
-              <w:bottom w:val="single" w:sz="4" w:space="0" w:color="000000"/>
-              <w:right w:val="single" w:sz="4" w:space="0" w:color="000000"/>
-            </w:tcBorders>
-            <w:tcMar>
-              <w:top w:w="60" w:type="dxa"/>
-              <w:left w:w="100" w:type="dxa"/>
-              <w:bottom w:w="60" w:type="dxa"/>
-              <w:right w:w="100" w:type="dxa"/>
-            </w:tcMar>
-          </w:tcPr>
-          <w:p>
-            <w:r>
-              <w:rPr>
-                <w:sz w:val="19"/>
-                <w:szCs w:val="19"/>
-              </w:rPr>
-              <w:t xml:space="preserve">The Employee </w:t>
-            </w:r>
-            <w:proofErr w:type="spellStart"/>
-            <w:r>
-              <w:rPr>
-                <w:sz w:val="19"/>
-                <w:szCs w:val="19"/>
-              </w:rPr>
-              <w:t>Center</w:t>
-            </w:r>
-            <w:proofErr w:type="spellEnd"/>
-            <w:r>
-              <w:rPr>
-                <w:sz w:val="19"/>
-                <w:szCs w:val="19"/>
-              </w:rPr>
-              <w:t xml:space="preserve"> portal opens at the project URL.</w:t>
+              <w:t>The Employee Center portal opens at the project URL.</w:t>
             </w:r>
           </w:p>
         </w:tc>
@@ -17541,27 +16951,7 @@
           <w:szCs w:val="24"/>
         </w:rPr>
         <w:lastRenderedPageBreak/>
-        <w:t xml:space="preserve">Output 1 – Employee </w:t>
-      </w:r>
-      <w:proofErr w:type="spellStart"/>
-      <w:r>
-        <w:rPr>
-          <w:b/>
-          <w:bCs/>
-          <w:sz w:val="24"/>
-          <w:szCs w:val="24"/>
-        </w:rPr>
-        <w:t>Center</w:t>
-      </w:r>
-      <w:proofErr w:type="spellEnd"/>
-      <w:r>
-        <w:rPr>
-          <w:b/>
-          <w:bCs/>
-          <w:sz w:val="24"/>
-          <w:szCs w:val="24"/>
-        </w:rPr>
-        <w:t xml:space="preserve"> Homepage</w:t>
+        <w:t>Output 1 – Employee Center Homepage</w:t>
       </w:r>
     </w:p>
     <w:p>
@@ -17759,13 +17149,19 @@
       <w:pPr>
         <w:keepNext/>
         <w:spacing w:before="200" w:after="80"/>
+        <w:rPr>
+          <w:b/>
+          <w:bCs/>
+          <w:sz w:val="24"/>
+          <w:szCs w:val="24"/>
+        </w:rPr>
       </w:pPr>
       <w:r>
         <w:drawing>
-          <wp:inline distT="0" distB="0" distL="0" distR="0" wp14:anchorId="04CAE81D" wp14:editId="4068EAAE">
-            <wp:extent cx="5731510" cy="959485"/>
+          <wp:inline distT="0" distB="0" distL="0" distR="0" wp14:anchorId="31005051" wp14:editId="46A3458B">
+            <wp:extent cx="5731510" cy="1854835"/>
             <wp:effectExtent l="0" t="0" r="2540" b="0"/>
-            <wp:docPr id="1276213881" name="Picture 1"/>
+            <wp:docPr id="911849523" name="Picture 1"/>
             <wp:cNvGraphicFramePr>
               <a:graphicFrameLocks xmlns:a="http://schemas.openxmlformats.org/drawingml/2006/main" noChangeAspect="1"/>
             </wp:cNvGraphicFramePr>
@@ -17773,7 +17169,7 @@
               <a:graphicData uri="http://schemas.openxmlformats.org/drawingml/2006/picture">
                 <pic:pic xmlns:pic="http://schemas.openxmlformats.org/drawingml/2006/picture">
                   <pic:nvPicPr>
-                    <pic:cNvPr id="1276213881" name=""/>
+                    <pic:cNvPr id="911849523" name=""/>
                     <pic:cNvPicPr/>
                   </pic:nvPicPr>
                   <pic:blipFill>
@@ -17785,7 +17181,7 @@
                   <pic:spPr>
                     <a:xfrm>
                       <a:off x="0" y="0"/>
-                      <a:ext cx="5731510" cy="959485"/>
+                      <a:ext cx="5731510" cy="1854835"/>
                     </a:xfrm>
                     <a:prstGeom prst="rect">
                       <a:avLst/>
@@ -17810,104 +17206,54 @@
     <w:p>
       <w:pPr>
         <w:keepNext/>
+        <w:spacing w:before="200" w:after="80"/>
+      </w:pPr>
+      <w:r>
+        <w:lastRenderedPageBreak/>
+        <w:drawing>
+          <wp:inline distT="0" distB="0" distL="0" distR="0" wp14:anchorId="51143C57" wp14:editId="04D1DF6B">
+            <wp:extent cx="5731510" cy="2200275"/>
+            <wp:effectExtent l="0" t="0" r="2540" b="9525"/>
+            <wp:docPr id="191755266" name="Picture 1"/>
+            <wp:cNvGraphicFramePr>
+              <a:graphicFrameLocks xmlns:a="http://schemas.openxmlformats.org/drawingml/2006/main" noChangeAspect="1"/>
+            </wp:cNvGraphicFramePr>
+            <a:graphic xmlns:a="http://schemas.openxmlformats.org/drawingml/2006/main">
+              <a:graphicData uri="http://schemas.openxmlformats.org/drawingml/2006/picture">
+                <pic:pic xmlns:pic="http://schemas.openxmlformats.org/drawingml/2006/picture">
+                  <pic:nvPicPr>
+                    <pic:cNvPr id="191755266" name=""/>
+                    <pic:cNvPicPr/>
+                  </pic:nvPicPr>
+                  <pic:blipFill>
+                    <a:blip r:embed="rId14"/>
+                    <a:stretch>
+                      <a:fillRect/>
+                    </a:stretch>
+                  </pic:blipFill>
+                  <pic:spPr>
+                    <a:xfrm>
+                      <a:off x="0" y="0"/>
+                      <a:ext cx="5731510" cy="2200275"/>
+                    </a:xfrm>
+                    <a:prstGeom prst="rect">
+                      <a:avLst/>
+                    </a:prstGeom>
+                  </pic:spPr>
+                </pic:pic>
+              </a:graphicData>
+            </a:graphic>
+          </wp:inline>
+        </w:drawing>
+      </w:r>
+    </w:p>
+    <w:p>
+      <w:pPr>
+        <w:keepNext/>
         <w:spacing w:after="100"/>
         <w:jc w:val="both"/>
       </w:pPr>
     </w:p>
-    <w:tbl>
-      <w:tblPr>
-        <w:tblW w:w="9026" w:type="dxa"/>
-        <w:tblBorders>
-          <w:top w:val="single" w:sz="4" w:space="0" w:color="auto"/>
-          <w:left w:val="single" w:sz="4" w:space="0" w:color="auto"/>
-          <w:bottom w:val="single" w:sz="4" w:space="0" w:color="auto"/>
-          <w:right w:val="single" w:sz="4" w:space="0" w:color="auto"/>
-          <w:insideH w:val="single" w:sz="4" w:space="0" w:color="auto"/>
-          <w:insideV w:val="single" w:sz="4" w:space="0" w:color="auto"/>
-        </w:tblBorders>
-        <w:tblCellMar>
-          <w:left w:w="10" w:type="dxa"/>
-          <w:right w:w="10" w:type="dxa"/>
-        </w:tblCellMar>
-        <w:tblLook w:val="0000" w:firstRow="0" w:lastRow="0" w:firstColumn="0" w:lastColumn="0" w:noHBand="0" w:noVBand="0"/>
-      </w:tblPr>
-      <w:tblGrid>
-        <w:gridCol w:w="9050"/>
-      </w:tblGrid>
-      <w:tr>
-        <w:tblPrEx>
-          <w:tblCellMar>
-            <w:top w:w="0" w:type="dxa"/>
-            <w:bottom w:w="0" w:type="dxa"/>
-          </w:tblCellMar>
-        </w:tblPrEx>
-        <w:trPr>
-          <w:cantSplit/>
-          <w:trHeight w:val="3000"/>
-        </w:trPr>
-        <w:tc>
-          <w:tcPr>
-            <w:tcW w:w="9026" w:type="dxa"/>
-            <w:tcBorders>
-              <w:top w:val="dashed" w:sz="8" w:space="0" w:color="7F7F7F"/>
-              <w:left w:val="dashed" w:sz="8" w:space="0" w:color="7F7F7F"/>
-              <w:bottom w:val="dashed" w:sz="8" w:space="0" w:color="7F7F7F"/>
-              <w:right w:val="dashed" w:sz="8" w:space="0" w:color="7F7F7F"/>
-            </w:tcBorders>
-            <w:shd w:val="clear" w:color="auto" w:fill="F7F7F7"/>
-            <w:vAlign w:val="center"/>
-          </w:tcPr>
-          <w:p>
-            <w:pPr>
-              <w:jc w:val="center"/>
-            </w:pPr>
-            <w:r>
-              <w:rPr>
-                <w:b/>
-                <w:bCs/>
-                <w:color w:val="7F7F7F"/>
-              </w:rPr>
-              <w:lastRenderedPageBreak/>
-              <w:drawing>
-                <wp:inline distT="0" distB="0" distL="0" distR="0" wp14:anchorId="6B9F82E3" wp14:editId="616D3FDD">
-                  <wp:extent cx="5731510" cy="3019425"/>
-                  <wp:effectExtent l="0" t="0" r="2540" b="9525"/>
-                  <wp:docPr id="1397361547" name="Picture 1"/>
-                  <wp:cNvGraphicFramePr>
-                    <a:graphicFrameLocks xmlns:a="http://schemas.openxmlformats.org/drawingml/2006/main" noChangeAspect="1"/>
-                  </wp:cNvGraphicFramePr>
-                  <a:graphic xmlns:a="http://schemas.openxmlformats.org/drawingml/2006/main">
-                    <a:graphicData uri="http://schemas.openxmlformats.org/drawingml/2006/picture">
-                      <pic:pic xmlns:pic="http://schemas.openxmlformats.org/drawingml/2006/picture">
-                        <pic:nvPicPr>
-                          <pic:cNvPr id="1397361547" name=""/>
-                          <pic:cNvPicPr/>
-                        </pic:nvPicPr>
-                        <pic:blipFill>
-                          <a:blip r:embed="rId14"/>
-                          <a:stretch>
-                            <a:fillRect/>
-                          </a:stretch>
-                        </pic:blipFill>
-                        <pic:spPr>
-                          <a:xfrm>
-                            <a:off x="0" y="0"/>
-                            <a:ext cx="5731510" cy="3019425"/>
-                          </a:xfrm>
-                          <a:prstGeom prst="rect">
-                            <a:avLst/>
-                          </a:prstGeom>
-                        </pic:spPr>
-                      </pic:pic>
-                    </a:graphicData>
-                  </a:graphic>
-                </wp:inline>
-              </w:drawing>
-            </w:r>
-          </w:p>
-        </w:tc>
-      </w:tr>
-    </w:tbl>
     <w:p>
       <w:pPr>
         <w:keepNext/>
@@ -17985,6 +17331,12 @@
       <w:pPr>
         <w:keepNext/>
         <w:spacing w:before="200" w:after="80"/>
+        <w:rPr>
+          <w:b/>
+          <w:bCs/>
+          <w:sz w:val="24"/>
+          <w:szCs w:val="24"/>
+        </w:rPr>
       </w:pPr>
       <w:r>
         <w:rPr>
@@ -18012,6 +17364,49 @@
           <w:szCs w:val="24"/>
         </w:rPr>
         <w:t xml:space="preserve"> – GitHub Repository</w:t>
+      </w:r>
+    </w:p>
+    <w:p>
+      <w:pPr>
+        <w:keepNext/>
+        <w:spacing w:before="200" w:after="80"/>
+      </w:pPr>
+      <w:r>
+        <w:drawing>
+          <wp:inline distT="0" distB="0" distL="0" distR="0" wp14:anchorId="4BE3657D" wp14:editId="21C628F0">
+            <wp:extent cx="5731510" cy="2662555"/>
+            <wp:effectExtent l="0" t="0" r="2540" b="4445"/>
+            <wp:docPr id="800770510" name="Picture 1"/>
+            <wp:cNvGraphicFramePr>
+              <a:graphicFrameLocks xmlns:a="http://schemas.openxmlformats.org/drawingml/2006/main" noChangeAspect="1"/>
+            </wp:cNvGraphicFramePr>
+            <a:graphic xmlns:a="http://schemas.openxmlformats.org/drawingml/2006/main">
+              <a:graphicData uri="http://schemas.openxmlformats.org/drawingml/2006/picture">
+                <pic:pic xmlns:pic="http://schemas.openxmlformats.org/drawingml/2006/picture">
+                  <pic:nvPicPr>
+                    <pic:cNvPr id="800770510" name=""/>
+                    <pic:cNvPicPr/>
+                  </pic:nvPicPr>
+                  <pic:blipFill>
+                    <a:blip r:embed="rId16"/>
+                    <a:stretch>
+                      <a:fillRect/>
+                    </a:stretch>
+                  </pic:blipFill>
+                  <pic:spPr>
+                    <a:xfrm>
+                      <a:off x="0" y="0"/>
+                      <a:ext cx="5731510" cy="2662555"/>
+                    </a:xfrm>
+                    <a:prstGeom prst="rect">
+                      <a:avLst/>
+                    </a:prstGeom>
+                  </pic:spPr>
+                </pic:pic>
+              </a:graphicData>
+            </a:graphic>
+          </wp:inline>
+        </w:drawing>
       </w:r>
     </w:p>
     <w:p>
@@ -18083,6 +17478,7 @@
                 <w:sz w:val="19"/>
                 <w:szCs w:val="19"/>
               </w:rPr>
+              <w:lastRenderedPageBreak/>
               <w:t>Objective</w:t>
             </w:r>
           </w:p>
@@ -18208,23 +17604,7 @@
                 <w:sz w:val="19"/>
                 <w:szCs w:val="19"/>
               </w:rPr>
-              <w:t xml:space="preserve">Employee </w:t>
-            </w:r>
-            <w:proofErr w:type="spellStart"/>
-            <w:r>
-              <w:rPr>
-                <w:sz w:val="19"/>
-                <w:szCs w:val="19"/>
-              </w:rPr>
-              <w:t>Center</w:t>
-            </w:r>
-            <w:proofErr w:type="spellEnd"/>
-            <w:r>
-              <w:rPr>
-                <w:sz w:val="19"/>
-                <w:szCs w:val="19"/>
-              </w:rPr>
-              <w:t>-based Service Portal available at the project URL.</w:t>
+              <w:t>Employee Center-based Service Portal available at the project URL.</w:t>
             </w:r>
           </w:p>
         </w:tc>
@@ -18658,7 +18038,6 @@
                 <w:sz w:val="19"/>
                 <w:szCs w:val="19"/>
               </w:rPr>
-              <w:lastRenderedPageBreak/>
               <w:t>Automated resolution / assignment / SLA / notifications</w:t>
             </w:r>
           </w:p>
@@ -19283,15 +18662,7 @@
         <w:jc w:val="both"/>
       </w:pPr>
       <w:r>
-        <w:t xml:space="preserve">The Employee Raise Issue Management System using ServiceNow project demonstrates how ServiceNow can be configured to give employees a centralised way to raise workplace and IT issues. Employees use an Employee </w:t>
-      </w:r>
-      <w:proofErr w:type="spellStart"/>
-      <w:r>
-        <w:t>Center</w:t>
-      </w:r>
-      <w:proofErr w:type="spellEnd"/>
-      <w:r>
-        <w:t>-based Service Portal, complete the structured Raise Employee Issue form, and submit it to create an Employee Issue record in a custom table. A test submission successfully created the ticket EMP0001004, confirming the end-to-end flow from portal submission to record creation.</w:t>
+        <w:t>The Employee Raise Issue Management System using ServiceNow project demonstrates how ServiceNow can be configured to give employees a centralised way to raise workplace and IT issues. Employees use an Employee Center-based Service Portal, complete the structured Raise Employee Issue form, and submit it to create an Employee Issue record in a custom table. A test submission successfully created the ticket EMP0001004, confirming the end-to-end flow from portal submission to record creation.</w:t>
       </w:r>
     </w:p>
     <w:p>
@@ -19844,23 +19215,7 @@
                 <w:sz w:val="18"/>
                 <w:szCs w:val="18"/>
               </w:rPr>
-              <w:t>Reference (</w:t>
-            </w:r>
-            <w:proofErr w:type="spellStart"/>
-            <w:r>
-              <w:rPr>
-                <w:sz w:val="18"/>
-                <w:szCs w:val="18"/>
-              </w:rPr>
-              <w:t>sys_user</w:t>
-            </w:r>
-            <w:proofErr w:type="spellEnd"/>
-            <w:r>
-              <w:rPr>
-                <w:sz w:val="18"/>
-                <w:szCs w:val="18"/>
-              </w:rPr>
-              <w:t>)</w:t>
+              <w:t>Reference (sys_user)</w:t>
             </w:r>
           </w:p>
         </w:tc>
@@ -21158,7 +20513,6 @@
             </w:tcMar>
           </w:tcPr>
           <w:p>
-            <w:proofErr w:type="spellStart"/>
             <w:r>
               <w:rPr>
                 <w:b/>
@@ -21168,7 +20522,6 @@
               </w:rPr>
               <w:t>sys_user</w:t>
             </w:r>
-            <w:proofErr w:type="spellEnd"/>
           </w:p>
         </w:tc>
         <w:tc>
@@ -21284,23 +20637,7 @@
                 <w:sz w:val="20"/>
                 <w:szCs w:val="20"/>
               </w:rPr>
-              <w:t xml:space="preserve">Service </w:t>
-            </w:r>
-            <w:proofErr w:type="spellStart"/>
-            <w:r>
-              <w:rPr>
-                <w:sz w:val="20"/>
-                <w:szCs w:val="20"/>
-              </w:rPr>
-              <w:t>Catalog</w:t>
-            </w:r>
-            <w:proofErr w:type="spellEnd"/>
-            <w:r>
-              <w:rPr>
-                <w:sz w:val="20"/>
-                <w:szCs w:val="20"/>
-              </w:rPr>
-              <w:t xml:space="preserve"> record producer</w:t>
+              <w:t>Service Catalog record producer</w:t>
             </w:r>
           </w:p>
         </w:tc>
@@ -21741,23 +21078,7 @@
                 <w:sz w:val="19"/>
                 <w:szCs w:val="19"/>
               </w:rPr>
-              <w:t xml:space="preserve">Employee can access the Employee </w:t>
-            </w:r>
-            <w:proofErr w:type="spellStart"/>
-            <w:r>
-              <w:rPr>
-                <w:sz w:val="19"/>
-                <w:szCs w:val="19"/>
-              </w:rPr>
-              <w:t>Center</w:t>
-            </w:r>
-            <w:proofErr w:type="spellEnd"/>
-            <w:r>
-              <w:rPr>
-                <w:sz w:val="19"/>
-                <w:szCs w:val="19"/>
-              </w:rPr>
-              <w:t xml:space="preserve"> portal.</w:t>
+              <w:t>Employee can access the Employee Center portal.</w:t>
             </w:r>
           </w:p>
         </w:tc>
@@ -22177,8 +21498,8 @@
     </w:tbl>
     <w:p/>
     <w:sectPr>
-      <w:headerReference w:type="default" r:id="rId16"/>
-      <w:footerReference w:type="default" r:id="rId17"/>
+      <w:headerReference w:type="default" r:id="rId17"/>
+      <w:footerReference w:type="default" r:id="rId18"/>
       <w:pgSz w:w="11906" w:h="16838"/>
       <w:pgMar w:top="1300" w:right="1440" w:bottom="1200" w:left="1440" w:header="600" w:footer="500" w:gutter="0"/>
       <w:cols w:space="720"/>

</xml_diff>